<commit_message>
Added shell files and the part2 docx changes
</commit_message>
<xml_diff>
--- a/CS Group Project Pt 2.docx
+++ b/CS Group Project Pt 2.docx
@@ -3,164 +3,495 @@
 <w:document xmlns:wpc="http://schemas.microsoft.com/office/word/2010/wordprocessingCanvas" xmlns:cx="http://schemas.microsoft.com/office/drawing/2014/chartex" xmlns:cx1="http://schemas.microsoft.com/office/drawing/2015/9/8/chartex" xmlns:cx2="http://schemas.microsoft.com/office/drawing/2015/10/21/chartex" xmlns:cx3="http://schemas.microsoft.com/office/drawing/2016/5/9/chartex" xmlns:cx4="http://schemas.microsoft.com/office/drawing/2016/5/10/chartex" xmlns:cx5="http://schemas.microsoft.com/office/drawing/2016/5/11/chartex" xmlns:cx6="http://schemas.microsoft.com/office/drawing/2016/5/12/chartex" xmlns:cx7="http://schemas.microsoft.com/office/drawing/2016/5/13/chartex" xmlns:cx8="http://schemas.microsoft.com/office/drawing/2016/5/14/chartex" xmlns:mc="http://schemas.openxmlformats.org/markup-compatibility/2006" xmlns:aink="http://schemas.microsoft.com/office/drawing/2016/ink" xmlns:am3d="http://schemas.microsoft.com/office/drawing/2017/model3d" xmlns:o="urn:schemas-microsoft-com:office:office" xmlns:oel="http://schemas.microsoft.com/office/2019/extlst" xmlns:r="http://schemas.openxmlformats.org/officeDocument/2006/relationships" xmlns:m="http://schemas.openxmlformats.org/officeDocument/2006/math" xmlns:v="urn:schemas-microsoft-com:vml" xmlns:wp14="http://schemas.microsoft.com/office/word/2010/wordprocessingDrawing" xmlns:wp="http://schemas.openxmlformats.org/drawingml/2006/wordprocessingDrawing" xmlns:w10="urn:schemas-microsoft-com:office:word" xmlns:w="http://schemas.openxmlformats.org/wordprocessingml/2006/main" xmlns:w14="http://schemas.microsoft.com/office/word/2010/wordml" xmlns:w15="http://schemas.microsoft.com/office/word/2012/wordml" xmlns:w16cex="http://schemas.microsoft.com/office/word/2018/wordml/cex" xmlns:w16cid="http://schemas.microsoft.com/office/word/2016/wordml/cid" xmlns:w16="http://schemas.microsoft.com/office/word/2018/wordml" xmlns:w16du="http://schemas.microsoft.com/office/word/2023/wordml/word16du" xmlns:w16sdtdh="http://schemas.microsoft.com/office/word/2020/wordml/sdtdatahash" xmlns:w16sdtfl="http://schemas.microsoft.com/office/word/2024/wordml/sdtformatlock" xmlns:w16se="http://schemas.microsoft.com/office/word/2015/wordml/symex" xmlns:wpg="http://schemas.microsoft.com/office/word/2010/wordprocessingGroup" xmlns:wpi="http://schemas.microsoft.com/office/word/2010/wordprocessingInk" xmlns:wne="http://schemas.microsoft.com/office/word/2006/wordml" xmlns:wps="http://schemas.microsoft.com/office/word/2010/wordprocessingShape" mc:Ignorable="w14 w15 w16se w16cid w16 w16cex w16sdtdh w16sdtfl w16du wp14">
   <w:body>
     <w:p>
-      <w:r>
+      <w:pPr>
+        <w:jc w:val="right"/>
+        <w:rPr>
+          <w:b/>
+          <w:bCs/>
+        </w:rPr>
+      </w:pPr>
+      <w:r>
+        <w:rPr>
+          <w:b/>
+          <w:bCs/>
+        </w:rPr>
         <w:t>CS 405 Group Project</w:t>
       </w:r>
     </w:p>
     <w:p>
-      <w:r>
+      <w:pPr>
+        <w:jc w:val="right"/>
+        <w:rPr>
+          <w:b/>
+          <w:bCs/>
+        </w:rPr>
+      </w:pPr>
+      <w:r>
+        <w:rPr>
+          <w:b/>
+          <w:bCs/>
+        </w:rPr>
+        <w:t>Sprint Semester 2026</w:t>
+      </w:r>
+    </w:p>
+    <w:p>
+      <w:pPr>
+        <w:jc w:val="right"/>
+        <w:rPr>
+          <w:b/>
+          <w:bCs/>
+        </w:rPr>
+      </w:pPr>
+      <w:r>
+        <w:rPr>
+          <w:b/>
+          <w:bCs/>
+        </w:rPr>
+        <w:t>Liz Morey, Nicholas Atchison, Jacob Blankenship, Luke Zurad</w:t>
+      </w:r>
+    </w:p>
+    <w:p>
+      <w:pPr>
+        <w:jc w:val="right"/>
+        <w:rPr>
+          <w:b/>
+          <w:bCs/>
+        </w:rPr>
+      </w:pPr>
+      <w:r>
+        <w:rPr>
+          <w:b/>
+          <w:bCs/>
+        </w:rPr>
         <w:t>Part II</w:t>
       </w:r>
     </w:p>
     <w:p>
-      <w:r>
+      <w:pPr>
+        <w:rPr>
+          <w:b/>
+          <w:bCs/>
+        </w:rPr>
+      </w:pPr>
+    </w:p>
+    <w:p>
+      <w:pPr>
+        <w:rPr>
+          <w:b/>
+          <w:bCs/>
+        </w:rPr>
+      </w:pPr>
+      <w:r>
+        <w:rPr>
+          <w:b/>
+          <w:bCs/>
+        </w:rPr>
         <w:t>Schemas:</w:t>
       </w:r>
     </w:p>
     <w:p>
-      <w:r>
-        <w:t>Meetings(</w:t>
-      </w:r>
-      <w:r>
-        <w:rPr>
-          <w:u w:val="single"/>
-        </w:rPr>
-        <w:t>date</w:t>
-      </w:r>
-      <w:r>
-        <w:t xml:space="preserve">, classroom, </w:t>
-      </w:r>
-      <w:proofErr w:type="spellStart"/>
-      <w:r>
-        <w:t>startTime</w:t>
-      </w:r>
-      <w:proofErr w:type="spellEnd"/>
+      <w:pPr>
+        <w:pStyle w:val="ListParagraph"/>
+        <w:numPr>
+          <w:ilvl w:val="0"/>
+          <w:numId w:val="1"/>
+        </w:numPr>
+        <w:spacing w:after="240"/>
+      </w:pPr>
+      <w:r>
+        <w:rPr>
+          <w:b/>
+          <w:bCs/>
+        </w:rPr>
+        <w:t xml:space="preserve">Meetings </w:t>
+      </w:r>
+      <w:r>
+        <w:t>(</w:t>
+      </w:r>
+      <w:r>
+        <w:rPr>
+          <w:u w:val="single"/>
+        </w:rPr>
+        <w:t>meetingDate</w:t>
+      </w:r>
+      <w:r>
+        <w:t xml:space="preserve">, classroom, meetingStartTime, meetingEndTime, meetingDescription, </w:t>
+      </w:r>
+      <w:r>
+        <w:rPr>
+          <w:u w:val="single"/>
+        </w:rPr>
+        <w:t>club</w:t>
+      </w:r>
+      <w:r>
+        <w:rPr>
+          <w:u w:val="single"/>
+        </w:rPr>
+        <w:t>N</w:t>
+      </w:r>
+      <w:r>
+        <w:rPr>
+          <w:u w:val="single"/>
+        </w:rPr>
+        <w:t>ame</w:t>
+      </w:r>
       <w:r>
         <w:t xml:space="preserve">, </w:t>
       </w:r>
-      <w:proofErr w:type="spellStart"/>
-      <w:r>
-        <w:t>endTime</w:t>
-      </w:r>
-      <w:proofErr w:type="spellEnd"/>
-      <w:r>
-        <w:t xml:space="preserve">, description, </w:t>
-      </w:r>
-      <w:proofErr w:type="spellStart"/>
-      <w:r>
-        <w:rPr>
-          <w:u w:val="single"/>
-        </w:rPr>
-        <w:t>clubname</w:t>
-      </w:r>
-      <w:proofErr w:type="spellEnd"/>
+      <w:r>
+        <w:rPr>
+          <w:u w:val="single"/>
+        </w:rPr>
+        <w:t>club</w:t>
+      </w:r>
+      <w:r>
+        <w:rPr>
+          <w:u w:val="single"/>
+        </w:rPr>
+        <w:t>Y</w:t>
+      </w:r>
+      <w:r>
+        <w:rPr>
+          <w:u w:val="single"/>
+        </w:rPr>
+        <w:t>ear</w:t>
+      </w:r>
+      <w:r>
+        <w:t>)</w:t>
+      </w:r>
+    </w:p>
+    <w:p>
+      <w:pPr>
+        <w:pStyle w:val="ListParagraph"/>
+        <w:numPr>
+          <w:ilvl w:val="1"/>
+          <w:numId w:val="1"/>
+        </w:numPr>
+        <w:spacing w:after="240"/>
+      </w:pPr>
+      <w:r>
+        <w:rPr>
+          <w:b/>
+          <w:bCs/>
+        </w:rPr>
+        <w:t xml:space="preserve">Primary Key: </w:t>
+      </w:r>
+      <w:r>
+        <w:t>(date, clubName, clubYear)</w:t>
+      </w:r>
+    </w:p>
+    <w:p>
+      <w:pPr>
+        <w:pStyle w:val="ListParagraph"/>
+        <w:numPr>
+          <w:ilvl w:val="1"/>
+          <w:numId w:val="1"/>
+        </w:numPr>
+        <w:spacing w:after="240"/>
+      </w:pPr>
+      <w:r>
+        <w:rPr>
+          <w:b/>
+          <w:bCs/>
+        </w:rPr>
+        <w:t>Dependencies:</w:t>
+      </w:r>
+      <w:r>
+        <w:rPr>
+          <w:b/>
+          <w:bCs/>
+        </w:rPr>
+        <w:t xml:space="preserve"> </w:t>
+      </w:r>
+      <w:r>
+        <w:t>(meetingDate, clubName, clubYear) -&gt; classroom, meetingStartTime, meetingEndTime, meetingDescription</w:t>
+      </w:r>
+    </w:p>
+    <w:p>
+      <w:pPr>
+        <w:pStyle w:val="ListParagraph"/>
+        <w:numPr>
+          <w:ilvl w:val="1"/>
+          <w:numId w:val="1"/>
+        </w:numPr>
+        <w:spacing w:after="240"/>
+      </w:pPr>
+      <w:r>
+        <w:t>All functional dependencies are in</w:t>
+      </w:r>
+      <w:r>
+        <w:t xml:space="preserve"> BCNF </w:t>
+      </w:r>
+      <w:r>
+        <w:t>as</w:t>
+      </w:r>
+      <w:r>
+        <w:t xml:space="preserve"> the primary key of “Meeting” is a superkey for all “Meeting” attributes.</w:t>
+      </w:r>
+      <w:r>
+        <w:t xml:space="preserve"> </w:t>
+      </w:r>
+      <w:r>
+        <w:t>There is no other dependencies.</w:t>
+      </w:r>
+    </w:p>
+    <w:p>
+      <w:pPr>
+        <w:pStyle w:val="ListParagraph"/>
+        <w:numPr>
+          <w:ilvl w:val="0"/>
+          <w:numId w:val="1"/>
+        </w:numPr>
+        <w:spacing w:after="240"/>
+      </w:pPr>
+      <w:r>
+        <w:rPr>
+          <w:b/>
+          <w:bCs/>
+        </w:rPr>
+        <w:t>Clubs</w:t>
+      </w:r>
+      <w:r>
+        <w:t xml:space="preserve"> (</w:t>
+      </w:r>
+      <w:r>
+        <w:rPr>
+          <w:u w:val="single"/>
+        </w:rPr>
+        <w:t>clubName</w:t>
+      </w:r>
       <w:r>
         <w:t xml:space="preserve">, </w:t>
       </w:r>
-      <w:proofErr w:type="spellStart"/>
-      <w:r>
-        <w:rPr>
-          <w:u w:val="single"/>
-        </w:rPr>
-        <w:t>clubyear</w:t>
-      </w:r>
-      <w:proofErr w:type="spellEnd"/>
+      <w:r>
+        <w:rPr>
+          <w:u w:val="single"/>
+        </w:rPr>
+        <w:t>clubYear</w:t>
+      </w:r>
+      <w:r>
+        <w:t xml:space="preserve">, </w:t>
+      </w:r>
+      <w:r>
+        <w:t>budget</w:t>
+      </w:r>
+      <w:r>
+        <w:t>, facultyID)</w:t>
+      </w:r>
+    </w:p>
+    <w:p>
+      <w:pPr>
+        <w:pStyle w:val="ListParagraph"/>
+        <w:numPr>
+          <w:ilvl w:val="1"/>
+          <w:numId w:val="1"/>
+        </w:numPr>
+        <w:spacing w:after="240"/>
+      </w:pPr>
+      <w:r>
+        <w:rPr>
+          <w:b/>
+          <w:bCs/>
+        </w:rPr>
+        <w:t xml:space="preserve">Primary Key: </w:t>
+      </w:r>
+      <w:r>
+        <w:t>(clubName, clubYear)</w:t>
+      </w:r>
+    </w:p>
+    <w:p>
+      <w:pPr>
+        <w:pStyle w:val="ListParagraph"/>
+        <w:numPr>
+          <w:ilvl w:val="1"/>
+          <w:numId w:val="1"/>
+        </w:numPr>
+        <w:spacing w:after="240"/>
+      </w:pPr>
+      <w:r>
+        <w:rPr>
+          <w:b/>
+          <w:bCs/>
+        </w:rPr>
+        <w:t>Dependencies:</w:t>
+      </w:r>
+      <w:r>
+        <w:t xml:space="preserve"> (clubName, clubYear) -&gt; budget, advisorID</w:t>
+      </w:r>
+    </w:p>
+    <w:p>
+      <w:pPr>
+        <w:pStyle w:val="ListParagraph"/>
+        <w:numPr>
+          <w:ilvl w:val="1"/>
+          <w:numId w:val="1"/>
+        </w:numPr>
+        <w:spacing w:after="240"/>
+      </w:pPr>
+      <w:r>
+        <w:t xml:space="preserve">All functional dependencies are in BCNF as </w:t>
+      </w:r>
+      <w:r>
+        <w:t>the primary key of “Club” is a superkey for all “Club” attributes. There is no other dependencies</w:t>
+      </w:r>
+      <w:r>
+        <w:t>.</w:t>
+      </w:r>
+    </w:p>
+    <w:p>
+      <w:pPr>
+        <w:pStyle w:val="ListParagraph"/>
+        <w:numPr>
+          <w:ilvl w:val="0"/>
+          <w:numId w:val="1"/>
+        </w:numPr>
+        <w:spacing w:after="240"/>
+      </w:pPr>
+      <w:r>
+        <w:rPr>
+          <w:b/>
+          <w:bCs/>
+        </w:rPr>
+        <w:t>Events</w:t>
+      </w:r>
+      <w:r>
+        <w:t xml:space="preserve"> (</w:t>
+      </w:r>
+      <w:r>
+        <w:rPr>
+          <w:u w:val="single"/>
+        </w:rPr>
+        <w:t>eventDate</w:t>
+      </w:r>
+      <w:r>
+        <w:t xml:space="preserve">, eventStartTime, eventEndTime, eventDescription, </w:t>
+      </w:r>
+      <w:r>
+        <w:rPr>
+          <w:u w:val="single"/>
+        </w:rPr>
+        <w:t>club</w:t>
+      </w:r>
+      <w:r>
+        <w:rPr>
+          <w:u w:val="single"/>
+        </w:rPr>
+        <w:t>N</w:t>
+      </w:r>
+      <w:r>
+        <w:rPr>
+          <w:u w:val="single"/>
+        </w:rPr>
+        <w:t>ame</w:t>
+      </w:r>
+      <w:r>
+        <w:t xml:space="preserve">, </w:t>
+      </w:r>
+      <w:r>
+        <w:rPr>
+          <w:u w:val="single"/>
+        </w:rPr>
+        <w:t>club</w:t>
+      </w:r>
+      <w:r>
+        <w:rPr>
+          <w:u w:val="single"/>
+        </w:rPr>
+        <w:t>Y</w:t>
+      </w:r>
+      <w:r>
+        <w:rPr>
+          <w:u w:val="single"/>
+        </w:rPr>
+        <w:t>ear</w:t>
+      </w:r>
       <w:r>
         <w:t>)</w:t>
       </w:r>
     </w:p>
     <w:p>
-      <w:r>
-        <w:t>Clubs(</w:t>
-      </w:r>
-      <w:r>
-        <w:rPr>
-          <w:u w:val="single"/>
-        </w:rPr>
-        <w:t>name</w:t>
-      </w:r>
-      <w:r>
-        <w:t xml:space="preserve">, </w:t>
-      </w:r>
-      <w:r>
-        <w:rPr>
-          <w:u w:val="single"/>
-        </w:rPr>
-        <w:t>year</w:t>
-      </w:r>
-      <w:r>
-        <w:t xml:space="preserve">, </w:t>
-      </w:r>
-      <w:r>
-        <w:t>budget</w:t>
-      </w:r>
-      <w:r>
-        <w:t xml:space="preserve">, </w:t>
-      </w:r>
-      <w:proofErr w:type="spellStart"/>
-      <w:r>
-        <w:t>advisorID</w:t>
-      </w:r>
-      <w:proofErr w:type="spellEnd"/>
-      <w:r>
-        <w:t>)</w:t>
-      </w:r>
-    </w:p>
-    <w:p>
-      <w:r>
-        <w:t>Events(</w:t>
-      </w:r>
-      <w:r>
-        <w:rPr>
-          <w:u w:val="single"/>
-        </w:rPr>
-        <w:t>date</w:t>
-      </w:r>
-      <w:r>
-        <w:t xml:space="preserve">, </w:t>
-      </w:r>
-      <w:proofErr w:type="spellStart"/>
-      <w:r>
-        <w:t>startTime</w:t>
-      </w:r>
-      <w:proofErr w:type="spellEnd"/>
-      <w:r>
-        <w:t xml:space="preserve">, </w:t>
-      </w:r>
-      <w:proofErr w:type="spellStart"/>
-      <w:r>
-        <w:t>endTime</w:t>
-      </w:r>
-      <w:proofErr w:type="spellEnd"/>
-      <w:r>
-        <w:t xml:space="preserve">, description, </w:t>
-      </w:r>
-      <w:proofErr w:type="spellStart"/>
-      <w:r>
-        <w:rPr>
-          <w:u w:val="single"/>
-        </w:rPr>
-        <w:t>clubname</w:t>
-      </w:r>
-      <w:proofErr w:type="spellEnd"/>
-      <w:r>
-        <w:t xml:space="preserve">, </w:t>
-      </w:r>
-      <w:proofErr w:type="spellStart"/>
-      <w:r>
-        <w:rPr>
-          <w:u w:val="single"/>
-        </w:rPr>
-        <w:t>clubyear</w:t>
-      </w:r>
-      <w:proofErr w:type="spellEnd"/>
-      <w:r>
-        <w:t>)</w:t>
-      </w:r>
-    </w:p>
-    <w:p>
-      <w:r>
-        <w:t>Faculty(</w:t>
+      <w:pPr>
+        <w:pStyle w:val="ListParagraph"/>
+        <w:numPr>
+          <w:ilvl w:val="1"/>
+          <w:numId w:val="1"/>
+        </w:numPr>
+        <w:spacing w:after="240"/>
+      </w:pPr>
+      <w:r>
+        <w:rPr>
+          <w:b/>
+          <w:bCs/>
+        </w:rPr>
+        <w:t xml:space="preserve">Primary Key: </w:t>
+      </w:r>
+      <w:r>
+        <w:t>(eventDate, clubName, clubYear)</w:t>
+      </w:r>
+    </w:p>
+    <w:p>
+      <w:pPr>
+        <w:pStyle w:val="ListParagraph"/>
+        <w:numPr>
+          <w:ilvl w:val="1"/>
+          <w:numId w:val="1"/>
+        </w:numPr>
+        <w:spacing w:after="240"/>
+      </w:pPr>
+      <w:r>
+        <w:rPr>
+          <w:b/>
+          <w:bCs/>
+        </w:rPr>
+        <w:t>Dependencies:</w:t>
+      </w:r>
+      <w:r>
+        <w:t xml:space="preserve"> </w:t>
+      </w:r>
+      <w:r>
+        <w:t>(meetingDate, clubName, clubYear) -&gt; classroom, meetingStartTime, meetingEndTime, meetingDescription</w:t>
+      </w:r>
+    </w:p>
+    <w:p>
+      <w:pPr>
+        <w:pStyle w:val="ListParagraph"/>
+        <w:numPr>
+          <w:ilvl w:val="1"/>
+          <w:numId w:val="1"/>
+        </w:numPr>
+        <w:spacing w:after="240"/>
+      </w:pPr>
+      <w:r>
+        <w:t xml:space="preserve">All functional dependencies are in BCNF as the primary key of </w:t>
+      </w:r>
+      <w:r>
+        <w:t>“Meeting” is a superkey for all “Meeting” attributes.</w:t>
+      </w:r>
+      <w:r>
+        <w:t xml:space="preserve"> </w:t>
+      </w:r>
+      <w:r>
+        <w:t>There is no other dependencies.</w:t>
+      </w:r>
+    </w:p>
+    <w:p>
+      <w:pPr>
+        <w:pStyle w:val="ListParagraph"/>
+        <w:numPr>
+          <w:ilvl w:val="0"/>
+          <w:numId w:val="1"/>
+        </w:numPr>
+        <w:spacing w:after="240"/>
+      </w:pPr>
+      <w:r>
+        <w:rPr>
+          <w:b/>
+          <w:bCs/>
+        </w:rPr>
+        <w:t>Faculty</w:t>
+      </w:r>
+      <w:r>
+        <w:t xml:space="preserve"> (faculty</w:t>
       </w:r>
       <w:r>
         <w:rPr>
@@ -169,112 +500,404 @@
         <w:t>ID</w:t>
       </w:r>
       <w:r>
-        <w:t>, name</w:t>
-      </w:r>
-      <w:r>
-        <w:t>)</w:t>
-      </w:r>
-    </w:p>
-    <w:p>
-      <w:r>
-        <w:t>Expenses(</w:t>
-      </w:r>
-      <w:proofErr w:type="spellStart"/>
-      <w:r>
-        <w:rPr>
-          <w:u w:val="single"/>
-        </w:rPr>
-        <w:t>ExpenseID</w:t>
-      </w:r>
-      <w:proofErr w:type="spellEnd"/>
-      <w:r>
-        <w:t xml:space="preserve">, date, amount, description, </w:t>
-      </w:r>
-      <w:proofErr w:type="spellStart"/>
-      <w:r>
-        <w:t>clubname</w:t>
-      </w:r>
-      <w:proofErr w:type="spellEnd"/>
-      <w:r>
-        <w:t xml:space="preserve">, </w:t>
-      </w:r>
-      <w:proofErr w:type="spellStart"/>
-      <w:r>
-        <w:t>clubyear</w:t>
-      </w:r>
-      <w:proofErr w:type="spellEnd"/>
-      <w:r>
-        <w:t>)</w:t>
-      </w:r>
-    </w:p>
-    <w:p>
-      <w:r>
-        <w:t>Students(</w:t>
-      </w:r>
-      <w:r>
-        <w:rPr>
-          <w:u w:val="single"/>
-        </w:rPr>
-        <w:t>ID</w:t>
-      </w:r>
-      <w:r>
-        <w:t>, name</w:t>
-      </w:r>
-      <w:r>
-        <w:t>)</w:t>
-      </w:r>
-    </w:p>
-    <w:p>
-      <w:pPr>
+        <w:t>, facultyName)</w:t>
+      </w:r>
+    </w:p>
+    <w:p>
+      <w:pPr>
+        <w:pStyle w:val="ListParagraph"/>
+        <w:numPr>
+          <w:ilvl w:val="1"/>
+          <w:numId w:val="1"/>
+        </w:numPr>
+        <w:spacing w:after="240"/>
+      </w:pPr>
+      <w:r>
+        <w:rPr>
+          <w:b/>
+          <w:bCs/>
+        </w:rPr>
+        <w:t>Primary Ke</w:t>
+      </w:r>
+      <w:r>
+        <w:rPr>
+          <w:b/>
+          <w:bCs/>
+        </w:rPr>
+        <w:t>y:</w:t>
+      </w:r>
+      <w:r>
+        <w:t xml:space="preserve"> (facultyID)</w:t>
+      </w:r>
+    </w:p>
+    <w:p>
+      <w:pPr>
+        <w:pStyle w:val="ListParagraph"/>
+        <w:numPr>
+          <w:ilvl w:val="1"/>
+          <w:numId w:val="1"/>
+        </w:numPr>
+        <w:spacing w:after="240"/>
+      </w:pPr>
+      <w:r>
+        <w:rPr>
+          <w:b/>
+          <w:bCs/>
+        </w:rPr>
+        <w:t xml:space="preserve">Dependencies: </w:t>
+      </w:r>
+      <w:r>
+        <w:t>facultyID -&gt; facultyName</w:t>
+      </w:r>
+    </w:p>
+    <w:p>
+      <w:pPr>
+        <w:pStyle w:val="ListParagraph"/>
+        <w:numPr>
+          <w:ilvl w:val="1"/>
+          <w:numId w:val="1"/>
+        </w:numPr>
+        <w:spacing w:after="240"/>
+      </w:pPr>
+      <w:r>
+        <w:t>All functional dependencies are in BCNF as there are only two attributes. All schemas with 2 attributes are in BCNF.</w:t>
+      </w:r>
+    </w:p>
+    <w:p>
+      <w:pPr>
+        <w:pStyle w:val="ListParagraph"/>
+        <w:numPr>
+          <w:ilvl w:val="0"/>
+          <w:numId w:val="1"/>
+        </w:numPr>
+        <w:spacing w:after="240"/>
+      </w:pPr>
+      <w:r>
+        <w:rPr>
+          <w:b/>
+          <w:bCs/>
+        </w:rPr>
+        <w:t>Expenses</w:t>
+      </w:r>
+      <w:r>
+        <w:t xml:space="preserve"> (</w:t>
+      </w:r>
+      <w:r>
+        <w:rPr>
+          <w:u w:val="single"/>
+        </w:rPr>
+        <w:t>e</w:t>
+      </w:r>
+      <w:r>
+        <w:rPr>
+          <w:u w:val="single"/>
+        </w:rPr>
+        <w:t>xpenseID</w:t>
+      </w:r>
+      <w:r>
+        <w:t>, expenseDate, amount, expenseDescription, clubName, clubYear)</w:t>
+      </w:r>
+    </w:p>
+    <w:p>
+      <w:pPr>
+        <w:pStyle w:val="ListParagraph"/>
+        <w:numPr>
+          <w:ilvl w:val="1"/>
+          <w:numId w:val="1"/>
+        </w:numPr>
+        <w:spacing w:after="240"/>
+      </w:pPr>
+      <w:r>
+        <w:rPr>
+          <w:b/>
+          <w:bCs/>
+        </w:rPr>
+        <w:t>Primary Key:</w:t>
+      </w:r>
+      <w:r>
+        <w:t xml:space="preserve"> (expenseID)</w:t>
+      </w:r>
+    </w:p>
+    <w:p>
+      <w:pPr>
+        <w:pStyle w:val="ListParagraph"/>
+        <w:numPr>
+          <w:ilvl w:val="1"/>
+          <w:numId w:val="1"/>
+        </w:numPr>
+        <w:spacing w:after="240"/>
+      </w:pPr>
+      <w:r>
+        <w:rPr>
+          <w:b/>
+          <w:bCs/>
+        </w:rPr>
+        <w:t>Dependencies</w:t>
+      </w:r>
+      <w:r>
+        <w:rPr>
+          <w:b/>
+          <w:bCs/>
+        </w:rPr>
+        <w:t xml:space="preserve">: </w:t>
+      </w:r>
+      <w:r>
+        <w:t>expenseID -&gt; expenseDate, amount, expenseDescription, clubName, clubYear</w:t>
+      </w:r>
+    </w:p>
+    <w:p>
+      <w:pPr>
+        <w:pStyle w:val="ListParagraph"/>
+        <w:numPr>
+          <w:ilvl w:val="1"/>
+          <w:numId w:val="1"/>
+        </w:numPr>
+        <w:spacing w:after="240"/>
+      </w:pPr>
+      <w:r>
+        <w:lastRenderedPageBreak/>
+        <w:t>All functional dependencies are in BCNF as the primary key of</w:t>
+      </w:r>
+      <w:r>
+        <w:t xml:space="preserve"> </w:t>
+      </w:r>
+      <w:r>
+        <w:t>“Expense” is a superkey for all “Expense” attributes.</w:t>
+      </w:r>
+      <w:r>
+        <w:t xml:space="preserve"> </w:t>
+      </w:r>
+      <w:r>
+        <w:t>There is no other dependencies.</w:t>
+      </w:r>
+    </w:p>
+    <w:p>
+      <w:pPr>
+        <w:pStyle w:val="ListParagraph"/>
+        <w:numPr>
+          <w:ilvl w:val="0"/>
+          <w:numId w:val="1"/>
+        </w:numPr>
+        <w:spacing w:after="240"/>
+      </w:pPr>
+      <w:r>
+        <w:rPr>
+          <w:b/>
+          <w:bCs/>
+        </w:rPr>
+        <w:t>Students</w:t>
+      </w:r>
+      <w:r>
+        <w:t xml:space="preserve"> (</w:t>
+      </w:r>
+      <w:r>
+        <w:rPr>
+          <w:u w:val="single"/>
+        </w:rPr>
+        <w:t>studentI</w:t>
+      </w:r>
+      <w:r>
+        <w:rPr>
+          <w:u w:val="single"/>
+        </w:rPr>
+        <w:t>D</w:t>
+      </w:r>
+      <w:r>
+        <w:t>, studentName)</w:t>
+      </w:r>
+    </w:p>
+    <w:p>
+      <w:pPr>
+        <w:pStyle w:val="ListParagraph"/>
+        <w:numPr>
+          <w:ilvl w:val="1"/>
+          <w:numId w:val="1"/>
+        </w:numPr>
+        <w:spacing w:after="240"/>
+      </w:pPr>
+      <w:r>
+        <w:rPr>
+          <w:b/>
+          <w:bCs/>
+        </w:rPr>
+        <w:t>Primary Key:</w:t>
+      </w:r>
+      <w:r>
+        <w:t xml:space="preserve"> (studentID)</w:t>
+      </w:r>
+    </w:p>
+    <w:p>
+      <w:pPr>
+        <w:pStyle w:val="ListParagraph"/>
+        <w:numPr>
+          <w:ilvl w:val="1"/>
+          <w:numId w:val="1"/>
+        </w:numPr>
+        <w:spacing w:after="240"/>
+      </w:pPr>
+      <w:r>
+        <w:rPr>
+          <w:b/>
+          <w:bCs/>
+        </w:rPr>
+        <w:t xml:space="preserve">Dependencies: </w:t>
+      </w:r>
+      <w:r>
+        <w:t>studentID -&gt; studentName</w:t>
+      </w:r>
+    </w:p>
+    <w:p>
+      <w:pPr>
+        <w:pStyle w:val="ListParagraph"/>
+        <w:numPr>
+          <w:ilvl w:val="1"/>
+          <w:numId w:val="1"/>
+        </w:numPr>
+        <w:spacing w:after="240"/>
+      </w:pPr>
+      <w:r>
+        <w:t xml:space="preserve">All functional dependencies are in BCNF as </w:t>
+      </w:r>
+      <w:r>
+        <w:t>there are only two attributes. All schemas with 2 attributes are in BCNF.</w:t>
+      </w:r>
+    </w:p>
+    <w:p>
+      <w:pPr>
+        <w:pStyle w:val="ListParagraph"/>
+        <w:numPr>
+          <w:ilvl w:val="0"/>
+          <w:numId w:val="1"/>
+        </w:numPr>
         <w:tabs>
           <w:tab w:val="left" w:pos="7149"/>
         </w:tabs>
-      </w:pPr>
-      <w:proofErr w:type="spellStart"/>
-      <w:r>
-        <w:t>AreIn</w:t>
-      </w:r>
-      <w:proofErr w:type="spellEnd"/>
-      <w:r>
-        <w:t>(</w:t>
-      </w:r>
-      <w:proofErr w:type="spellStart"/>
+        <w:spacing w:after="240"/>
+      </w:pPr>
+      <w:r>
+        <w:rPr>
+          <w:b/>
+          <w:bCs/>
+        </w:rPr>
+        <w:t>Are_In</w:t>
+      </w:r>
+      <w:r>
+        <w:t xml:space="preserve"> (</w:t>
+      </w:r>
       <w:r>
         <w:rPr>
           <w:u w:val="single"/>
         </w:rPr>
         <w:t>studentID</w:t>
       </w:r>
-      <w:proofErr w:type="spellEnd"/>
       <w:r>
         <w:t xml:space="preserve">, </w:t>
       </w:r>
-      <w:proofErr w:type="spellStart"/>
-      <w:r>
-        <w:rPr>
-          <w:u w:val="single"/>
-        </w:rPr>
-        <w:t>clubname</w:t>
-      </w:r>
-      <w:proofErr w:type="spellEnd"/>
+      <w:r>
+        <w:rPr>
+          <w:u w:val="single"/>
+        </w:rPr>
+        <w:t>club</w:t>
+      </w:r>
+      <w:r>
+        <w:rPr>
+          <w:u w:val="single"/>
+        </w:rPr>
+        <w:t>N</w:t>
+      </w:r>
+      <w:r>
+        <w:rPr>
+          <w:u w:val="single"/>
+        </w:rPr>
+        <w:t>ame</w:t>
+      </w:r>
       <w:r>
         <w:t xml:space="preserve">, </w:t>
       </w:r>
-      <w:proofErr w:type="spellStart"/>
-      <w:r>
-        <w:rPr>
-          <w:u w:val="single"/>
-        </w:rPr>
-        <w:t>clubyear</w:t>
-      </w:r>
-      <w:proofErr w:type="spellEnd"/>
+      <w:r>
+        <w:rPr>
+          <w:u w:val="single"/>
+        </w:rPr>
+        <w:t>club</w:t>
+      </w:r>
+      <w:r>
+        <w:rPr>
+          <w:u w:val="single"/>
+        </w:rPr>
+        <w:t>Y</w:t>
+      </w:r>
+      <w:r>
+        <w:rPr>
+          <w:u w:val="single"/>
+        </w:rPr>
+        <w:t>ear</w:t>
+      </w:r>
       <w:r>
         <w:t>)</w:t>
       </w:r>
-      <w:r>
-        <w:tab/>
-      </w:r>
-    </w:p>
+    </w:p>
+    <w:p>
+      <w:pPr>
+        <w:pStyle w:val="ListParagraph"/>
+        <w:numPr>
+          <w:ilvl w:val="1"/>
+          <w:numId w:val="1"/>
+        </w:numPr>
+        <w:spacing w:after="240"/>
+      </w:pPr>
+      <w:r>
+        <w:rPr>
+          <w:b/>
+          <w:bCs/>
+        </w:rPr>
+        <w:t>Primary Key:</w:t>
+      </w:r>
+      <w:r>
+        <w:t xml:space="preserve"> (studentID, clubName, clubYear)</w:t>
+      </w:r>
+    </w:p>
+    <w:p>
+      <w:pPr>
+        <w:pStyle w:val="ListParagraph"/>
+        <w:numPr>
+          <w:ilvl w:val="1"/>
+          <w:numId w:val="1"/>
+        </w:numPr>
+        <w:spacing w:after="240"/>
+      </w:pPr>
+      <w:r>
+        <w:rPr>
+          <w:b/>
+          <w:bCs/>
+        </w:rPr>
+        <w:t>Dependencies:</w:t>
+      </w:r>
+      <w:r>
+        <w:t xml:space="preserve"> No dependencies (as all attributes are the only key/superkey in table)</w:t>
+      </w:r>
+    </w:p>
+    <w:p>
+      <w:pPr>
+        <w:pStyle w:val="ListParagraph"/>
+        <w:numPr>
+          <w:ilvl w:val="1"/>
+          <w:numId w:val="1"/>
+        </w:numPr>
+        <w:spacing w:after="240"/>
+      </w:pPr>
+      <w:r>
+        <w:t>This table is in BCNF as there are no functional dependencies</w:t>
+      </w:r>
+      <w:r>
+        <w:t>.</w:t>
+      </w:r>
+    </w:p>
+    <w:p>
+      <w:pPr>
+        <w:spacing w:after="240"/>
+      </w:pPr>
+    </w:p>
+    <w:p/>
     <w:sectPr>
       <w:pgSz w:w="12240" w:h="15840"/>
       <w:pgMar w:top="1440" w:right="1440" w:bottom="1440" w:left="1440" w:header="720" w:footer="720" w:gutter="0"/>
@@ -283,6 +906,243 @@
     </w:sectPr>
   </w:body>
 </w:document>
+</file>
+
+<file path=word/numbering.xml><?xml version="1.0" encoding="utf-8"?>
+<w:numbering xmlns:wpc="http://schemas.microsoft.com/office/word/2010/wordprocessingCanvas" xmlns:cx="http://schemas.microsoft.com/office/drawing/2014/chartex" xmlns:cx1="http://schemas.microsoft.com/office/drawing/2015/9/8/chartex" xmlns:cx2="http://schemas.microsoft.com/office/drawing/2015/10/21/chartex" xmlns:cx3="http://schemas.microsoft.com/office/drawing/2016/5/9/chartex" xmlns:cx4="http://schemas.microsoft.com/office/drawing/2016/5/10/chartex" xmlns:cx5="http://schemas.microsoft.com/office/drawing/2016/5/11/chartex" xmlns:cx6="http://schemas.microsoft.com/office/drawing/2016/5/12/chartex" xmlns:cx7="http://schemas.microsoft.com/office/drawing/2016/5/13/chartex" xmlns:cx8="http://schemas.microsoft.com/office/drawing/2016/5/14/chartex" xmlns:mc="http://schemas.openxmlformats.org/markup-compatibility/2006" xmlns:aink="http://schemas.microsoft.com/office/drawing/2016/ink" xmlns:am3d="http://schemas.microsoft.com/office/drawing/2017/model3d" xmlns:o="urn:schemas-microsoft-com:office:office" xmlns:oel="http://schemas.microsoft.com/office/2019/extlst" xmlns:r="http://schemas.openxmlformats.org/officeDocument/2006/relationships" xmlns:m="http://schemas.openxmlformats.org/officeDocument/2006/math" xmlns:v="urn:schemas-microsoft-com:vml" xmlns:wp14="http://schemas.microsoft.com/office/word/2010/wordprocessingDrawing" xmlns:wp="http://schemas.openxmlformats.org/drawingml/2006/wordprocessingDrawing" xmlns:w10="urn:schemas-microsoft-com:office:word" xmlns:w="http://schemas.openxmlformats.org/wordprocessingml/2006/main" xmlns:w14="http://schemas.microsoft.com/office/word/2010/wordml" xmlns:w15="http://schemas.microsoft.com/office/word/2012/wordml" xmlns:w16cex="http://schemas.microsoft.com/office/word/2018/wordml/cex" xmlns:w16cid="http://schemas.microsoft.com/office/word/2016/wordml/cid" xmlns:w16="http://schemas.microsoft.com/office/word/2018/wordml" xmlns:w16du="http://schemas.microsoft.com/office/word/2023/wordml/word16du" xmlns:w16sdtdh="http://schemas.microsoft.com/office/word/2020/wordml/sdtdatahash" xmlns:w16sdtfl="http://schemas.microsoft.com/office/word/2024/wordml/sdtformatlock" xmlns:w16se="http://schemas.microsoft.com/office/word/2015/wordml/symex" xmlns:wpg="http://schemas.microsoft.com/office/word/2010/wordprocessingGroup" xmlns:wpi="http://schemas.microsoft.com/office/word/2010/wordprocessingInk" xmlns:wne="http://schemas.microsoft.com/office/word/2006/wordml" xmlns:wps="http://schemas.microsoft.com/office/word/2010/wordprocessingShape" mc:Ignorable="w14 w15 w16se w16cid w16 w16cex w16sdtdh w16sdtfl w16du wp14">
+  <w:abstractNum w:abstractNumId="0" w15:restartNumberingAfterBreak="0">
+    <w:nsid w:val="1E5F6A78"/>
+    <w:multiLevelType w:val="hybridMultilevel"/>
+    <w:tmpl w:val="719A9080"/>
+    <w:lvl w:ilvl="0" w:tplc="04090001">
+      <w:start w:val="1"/>
+      <w:numFmt w:val="bullet"/>
+      <w:lvlText w:val=""/>
+      <w:lvlJc w:val="left"/>
+      <w:pPr>
+        <w:ind w:left="720" w:hanging="360"/>
+      </w:pPr>
+      <w:rPr>
+        <w:rFonts w:ascii="Symbol" w:hAnsi="Symbol" w:hint="default"/>
+      </w:rPr>
+    </w:lvl>
+    <w:lvl w:ilvl="1" w:tplc="04090003">
+      <w:start w:val="1"/>
+      <w:numFmt w:val="bullet"/>
+      <w:lvlText w:val="o"/>
+      <w:lvlJc w:val="left"/>
+      <w:pPr>
+        <w:ind w:left="1440" w:hanging="360"/>
+      </w:pPr>
+      <w:rPr>
+        <w:rFonts w:ascii="Courier New" w:hAnsi="Courier New" w:cs="Courier New" w:hint="default"/>
+      </w:rPr>
+    </w:lvl>
+    <w:lvl w:ilvl="2" w:tplc="04090005" w:tentative="1">
+      <w:start w:val="1"/>
+      <w:numFmt w:val="bullet"/>
+      <w:lvlText w:val=""/>
+      <w:lvlJc w:val="left"/>
+      <w:pPr>
+        <w:ind w:left="2160" w:hanging="360"/>
+      </w:pPr>
+      <w:rPr>
+        <w:rFonts w:ascii="Wingdings" w:hAnsi="Wingdings" w:hint="default"/>
+      </w:rPr>
+    </w:lvl>
+    <w:lvl w:ilvl="3" w:tplc="04090001" w:tentative="1">
+      <w:start w:val="1"/>
+      <w:numFmt w:val="bullet"/>
+      <w:lvlText w:val=""/>
+      <w:lvlJc w:val="left"/>
+      <w:pPr>
+        <w:ind w:left="2880" w:hanging="360"/>
+      </w:pPr>
+      <w:rPr>
+        <w:rFonts w:ascii="Symbol" w:hAnsi="Symbol" w:hint="default"/>
+      </w:rPr>
+    </w:lvl>
+    <w:lvl w:ilvl="4" w:tplc="04090003" w:tentative="1">
+      <w:start w:val="1"/>
+      <w:numFmt w:val="bullet"/>
+      <w:lvlText w:val="o"/>
+      <w:lvlJc w:val="left"/>
+      <w:pPr>
+        <w:ind w:left="3600" w:hanging="360"/>
+      </w:pPr>
+      <w:rPr>
+        <w:rFonts w:ascii="Courier New" w:hAnsi="Courier New" w:cs="Courier New" w:hint="default"/>
+      </w:rPr>
+    </w:lvl>
+    <w:lvl w:ilvl="5" w:tplc="04090005" w:tentative="1">
+      <w:start w:val="1"/>
+      <w:numFmt w:val="bullet"/>
+      <w:lvlText w:val=""/>
+      <w:lvlJc w:val="left"/>
+      <w:pPr>
+        <w:ind w:left="4320" w:hanging="360"/>
+      </w:pPr>
+      <w:rPr>
+        <w:rFonts w:ascii="Wingdings" w:hAnsi="Wingdings" w:hint="default"/>
+      </w:rPr>
+    </w:lvl>
+    <w:lvl w:ilvl="6" w:tplc="04090001" w:tentative="1">
+      <w:start w:val="1"/>
+      <w:numFmt w:val="bullet"/>
+      <w:lvlText w:val=""/>
+      <w:lvlJc w:val="left"/>
+      <w:pPr>
+        <w:ind w:left="5040" w:hanging="360"/>
+      </w:pPr>
+      <w:rPr>
+        <w:rFonts w:ascii="Symbol" w:hAnsi="Symbol" w:hint="default"/>
+      </w:rPr>
+    </w:lvl>
+    <w:lvl w:ilvl="7" w:tplc="04090003" w:tentative="1">
+      <w:start w:val="1"/>
+      <w:numFmt w:val="bullet"/>
+      <w:lvlText w:val="o"/>
+      <w:lvlJc w:val="left"/>
+      <w:pPr>
+        <w:ind w:left="5760" w:hanging="360"/>
+      </w:pPr>
+      <w:rPr>
+        <w:rFonts w:ascii="Courier New" w:hAnsi="Courier New" w:cs="Courier New" w:hint="default"/>
+      </w:rPr>
+    </w:lvl>
+    <w:lvl w:ilvl="8" w:tplc="04090005" w:tentative="1">
+      <w:start w:val="1"/>
+      <w:numFmt w:val="bullet"/>
+      <w:lvlText w:val=""/>
+      <w:lvlJc w:val="left"/>
+      <w:pPr>
+        <w:ind w:left="6480" w:hanging="360"/>
+      </w:pPr>
+      <w:rPr>
+        <w:rFonts w:ascii="Wingdings" w:hAnsi="Wingdings" w:hint="default"/>
+      </w:rPr>
+    </w:lvl>
+  </w:abstractNum>
+  <w:abstractNum w:abstractNumId="1" w15:restartNumberingAfterBreak="0">
+    <w:nsid w:val="7832737E"/>
+    <w:multiLevelType w:val="hybridMultilevel"/>
+    <w:tmpl w:val="00807C20"/>
+    <w:lvl w:ilvl="0" w:tplc="04090001">
+      <w:start w:val="1"/>
+      <w:numFmt w:val="bullet"/>
+      <w:lvlText w:val=""/>
+      <w:lvlJc w:val="left"/>
+      <w:pPr>
+        <w:ind w:left="1080" w:hanging="360"/>
+      </w:pPr>
+      <w:rPr>
+        <w:rFonts w:ascii="Symbol" w:hAnsi="Symbol" w:hint="default"/>
+      </w:rPr>
+    </w:lvl>
+    <w:lvl w:ilvl="1" w:tplc="04090003">
+      <w:start w:val="1"/>
+      <w:numFmt w:val="bullet"/>
+      <w:lvlText w:val="o"/>
+      <w:lvlJc w:val="left"/>
+      <w:pPr>
+        <w:ind w:left="1800" w:hanging="360"/>
+      </w:pPr>
+      <w:rPr>
+        <w:rFonts w:ascii="Courier New" w:hAnsi="Courier New" w:cs="Courier New" w:hint="default"/>
+      </w:rPr>
+    </w:lvl>
+    <w:lvl w:ilvl="2" w:tplc="04090005" w:tentative="1">
+      <w:start w:val="1"/>
+      <w:numFmt w:val="bullet"/>
+      <w:lvlText w:val=""/>
+      <w:lvlJc w:val="left"/>
+      <w:pPr>
+        <w:ind w:left="2520" w:hanging="360"/>
+      </w:pPr>
+      <w:rPr>
+        <w:rFonts w:ascii="Wingdings" w:hAnsi="Wingdings" w:hint="default"/>
+      </w:rPr>
+    </w:lvl>
+    <w:lvl w:ilvl="3" w:tplc="04090001" w:tentative="1">
+      <w:start w:val="1"/>
+      <w:numFmt w:val="bullet"/>
+      <w:lvlText w:val=""/>
+      <w:lvlJc w:val="left"/>
+      <w:pPr>
+        <w:ind w:left="3240" w:hanging="360"/>
+      </w:pPr>
+      <w:rPr>
+        <w:rFonts w:ascii="Symbol" w:hAnsi="Symbol" w:hint="default"/>
+      </w:rPr>
+    </w:lvl>
+    <w:lvl w:ilvl="4" w:tplc="04090003" w:tentative="1">
+      <w:start w:val="1"/>
+      <w:numFmt w:val="bullet"/>
+      <w:lvlText w:val="o"/>
+      <w:lvlJc w:val="left"/>
+      <w:pPr>
+        <w:ind w:left="3960" w:hanging="360"/>
+      </w:pPr>
+      <w:rPr>
+        <w:rFonts w:ascii="Courier New" w:hAnsi="Courier New" w:cs="Courier New" w:hint="default"/>
+      </w:rPr>
+    </w:lvl>
+    <w:lvl w:ilvl="5" w:tplc="04090005" w:tentative="1">
+      <w:start w:val="1"/>
+      <w:numFmt w:val="bullet"/>
+      <w:lvlText w:val=""/>
+      <w:lvlJc w:val="left"/>
+      <w:pPr>
+        <w:ind w:left="4680" w:hanging="360"/>
+      </w:pPr>
+      <w:rPr>
+        <w:rFonts w:ascii="Wingdings" w:hAnsi="Wingdings" w:hint="default"/>
+      </w:rPr>
+    </w:lvl>
+    <w:lvl w:ilvl="6" w:tplc="04090001" w:tentative="1">
+      <w:start w:val="1"/>
+      <w:numFmt w:val="bullet"/>
+      <w:lvlText w:val=""/>
+      <w:lvlJc w:val="left"/>
+      <w:pPr>
+        <w:ind w:left="5400" w:hanging="360"/>
+      </w:pPr>
+      <w:rPr>
+        <w:rFonts w:ascii="Symbol" w:hAnsi="Symbol" w:hint="default"/>
+      </w:rPr>
+    </w:lvl>
+    <w:lvl w:ilvl="7" w:tplc="04090003" w:tentative="1">
+      <w:start w:val="1"/>
+      <w:numFmt w:val="bullet"/>
+      <w:lvlText w:val="o"/>
+      <w:lvlJc w:val="left"/>
+      <w:pPr>
+        <w:ind w:left="6120" w:hanging="360"/>
+      </w:pPr>
+      <w:rPr>
+        <w:rFonts w:ascii="Courier New" w:hAnsi="Courier New" w:cs="Courier New" w:hint="default"/>
+      </w:rPr>
+    </w:lvl>
+    <w:lvl w:ilvl="8" w:tplc="04090005" w:tentative="1">
+      <w:start w:val="1"/>
+      <w:numFmt w:val="bullet"/>
+      <w:lvlText w:val=""/>
+      <w:lvlJc w:val="left"/>
+      <w:pPr>
+        <w:ind w:left="6840" w:hanging="360"/>
+      </w:pPr>
+      <w:rPr>
+        <w:rFonts w:ascii="Wingdings" w:hAnsi="Wingdings" w:hint="default"/>
+      </w:rPr>
+    </w:lvl>
+  </w:abstractNum>
+  <w:num w:numId="1" w16cid:durableId="1384408121">
+    <w:abstractNumId w:val="0"/>
+  </w:num>
+  <w:num w:numId="2" w16cid:durableId="1111314369">
+    <w:abstractNumId w:val="1"/>
+  </w:num>
+</w:numbering>
 </file>
 
 <file path=word/styles.xml><?xml version="1.0" encoding="utf-8"?>

</xml_diff>